<commit_message>
Improve SKILL docs, fix DOCX formatting, add equity audit trail
- Rewrite heuristic_rationale.md with verified sources (32 URLs)
- Enhance all 5 SKILL.md files with clearer instructions and examples
- Add intake_questionnaire.md quick-reference for founders
- Fix DOCX export: Times New Roman fonts (override theme), table borders
  (post-process), clickable source URLs (markdown link preprocessing)
- Add equity suggestion metadata to assumptions internal targets
- Add equity audit trail to financial model outputs schema
- Change sample intake to equity_mode=suggest (exercises optimization loop)
- Update README: add python-docx to requirements, .docx to outputs,
  remove redundant D2C CPG from roadmap

Co-Authored-By: Claude Opus 4.6 <noreply@anthropic.com>
</commit_message>
<xml_diff>
--- a/bizplan-ecommerce/skills/ecommerce-document-export/templates/reference.docx
+++ b/bizplan-ecommerce/skills/ecommerce-document-export/templates/reference.docx
@@ -722,7 +722,7 @@
       <w:spacing w:after="160" w:line="276" w:lineRule="auto"/>
     </w:pPr>
     <w:rPr>
-      <w:rFonts w:ascii="Calibri" w:hAnsi="Calibri"/>
+      <w:rFonts w:ascii="Times New Roman" w:hAnsi="Times New Roman"/>
       <w:color w:val="333333"/>
       <w:sz w:val="22"/>
     </w:rPr>
@@ -787,12 +787,12 @@
       <w:outlineLvl w:val="0"/>
     </w:pPr>
     <w:rPr>
-      <w:rFonts w:asciiTheme="majorHAnsi" w:eastAsiaTheme="majorEastAsia" w:hAnsiTheme="majorHAnsi" w:cstheme="majorBidi" w:ascii="Calibri" w:hAnsi="Calibri"/>
       <w:b/>
       <w:bCs/>
       <w:color w:val="1A365D"/>
       <w:sz w:val="48"/>
       <w:szCs w:val="28"/>
+      <w:rFonts w:ascii="Times New Roman" w:hAnsi="Times New Roman" w:cs="Times New Roman"/>
     </w:rPr>
   </w:style>
   <w:style w:type="paragraph" w:styleId="Heading2">
@@ -811,12 +811,12 @@
       <w:outlineLvl w:val="1"/>
     </w:pPr>
     <w:rPr>
-      <w:rFonts w:asciiTheme="majorHAnsi" w:eastAsiaTheme="majorEastAsia" w:hAnsiTheme="majorHAnsi" w:cstheme="majorBidi" w:ascii="Calibri" w:hAnsi="Calibri"/>
       <w:b/>
       <w:bCs/>
       <w:color w:val="2E5C8A"/>
       <w:sz w:val="36"/>
       <w:szCs w:val="26"/>
+      <w:rFonts w:ascii="Times New Roman" w:hAnsi="Times New Roman" w:cs="Times New Roman"/>
     </w:rPr>
   </w:style>
   <w:style w:type="paragraph" w:styleId="Heading3">
@@ -835,11 +835,11 @@
       <w:outlineLvl w:val="2"/>
     </w:pPr>
     <w:rPr>
-      <w:rFonts w:asciiTheme="majorHAnsi" w:eastAsiaTheme="majorEastAsia" w:hAnsiTheme="majorHAnsi" w:cstheme="majorBidi" w:ascii="Calibri" w:hAnsi="Calibri"/>
       <w:b/>
       <w:bCs/>
       <w:color w:val="3D85C6"/>
       <w:sz w:val="28"/>
+      <w:rFonts w:ascii="Times New Roman" w:hAnsi="Times New Roman" w:cs="Times New Roman"/>
     </w:rPr>
   </w:style>
   <w:style w:type="paragraph" w:styleId="Heading4">
@@ -859,13 +859,13 @@
       <w:outlineLvl w:val="3"/>
     </w:pPr>
     <w:rPr>
-      <w:rFonts w:asciiTheme="majorHAnsi" w:eastAsiaTheme="majorEastAsia" w:hAnsiTheme="majorHAnsi" w:cstheme="majorBidi" w:ascii="Calibri" w:hAnsi="Calibri"/>
       <w:b/>
       <w:bCs/>
       <w:i/>
       <w:iCs/>
       <w:color w:val="333333"/>
       <w:sz w:val="24"/>
+      <w:rFonts w:ascii="Times New Roman" w:hAnsi="Times New Roman" w:cs="Times New Roman"/>
     </w:rPr>
   </w:style>
   <w:style w:type="paragraph" w:styleId="Heading5">
@@ -1079,13 +1079,13 @@
       <w:jc w:val="center"/>
     </w:pPr>
     <w:rPr>
-      <w:rFonts w:asciiTheme="majorHAnsi" w:eastAsiaTheme="majorEastAsia" w:hAnsiTheme="majorHAnsi" w:cstheme="majorBidi" w:ascii="Calibri" w:hAnsi="Calibri"/>
       <w:b/>
       <w:color w:val="1A365D"/>
       <w:spacing w:val="5"/>
       <w:kern w:val="28"/>
       <w:sz w:val="88"/>
       <w:szCs w:val="52"/>
+      <w:rFonts w:ascii="Times New Roman" w:hAnsi="Times New Roman" w:cs="Times New Roman"/>
     </w:rPr>
   </w:style>
   <w:style w:type="character" w:customStyle="1" w:styleId="TitleChar">
@@ -1119,7 +1119,6 @@
       <w:jc w:val="center"/>
     </w:pPr>
     <w:rPr>
-      <w:rFonts w:asciiTheme="majorHAnsi" w:eastAsiaTheme="majorEastAsia" w:hAnsiTheme="majorHAnsi" w:cstheme="majorBidi" w:ascii="Calibri" w:hAnsi="Calibri"/>
       <w:b w:val="0"/>
       <w:i/>
       <w:iCs/>
@@ -1127,6 +1126,7 @@
       <w:spacing w:val="15"/>
       <w:sz w:val="48"/>
       <w:szCs w:val="24"/>
+      <w:rFonts w:ascii="Times New Roman" w:hAnsi="Times New Roman" w:cs="Times New Roman"/>
     </w:rPr>
   </w:style>
   <w:style w:type="character" w:customStyle="1" w:styleId="SubtitleChar">
@@ -1670,10 +1670,10 @@
       <w:outlineLvl w:val="9"/>
     </w:pPr>
     <w:rPr>
-      <w:rFonts w:ascii="Calibri" w:hAnsi="Calibri"/>
       <w:b/>
       <w:color w:val="1A365D"/>
       <w:sz w:val="32"/>
+      <w:rFonts w:ascii="Times New Roman" w:hAnsi="Times New Roman" w:cs="Times New Roman"/>
     </w:rPr>
   </w:style>
   <w:style w:type="table" w:styleId="TableGrid">
@@ -12429,9 +12429,9 @@
       <w:jc w:val="center"/>
     </w:pPr>
     <w:rPr>
-      <w:rFonts w:ascii="Calibri" w:hAnsi="Calibri"/>
       <w:color w:val="333333"/>
       <w:sz w:val="28"/>
+      <w:rFonts w:ascii="Times New Roman" w:hAnsi="Times New Roman" w:cs="Times New Roman"/>
     </w:rPr>
   </w:style>
   <w:style w:type="character" w:customStyle="1" w:styleId="Hyperlink">
@@ -12448,10 +12448,10 @@
       <w:ind w:left="720"/>
     </w:pPr>
     <w:rPr>
-      <w:rFonts w:ascii="Calibri" w:hAnsi="Calibri"/>
       <w:i/>
       <w:color w:val="666666"/>
       <w:sz w:val="22"/>
+      <w:rFonts w:ascii="Times New Roman" w:hAnsi="Times New Roman" w:cs="Times New Roman"/>
     </w:rPr>
   </w:style>
 </w:styles>

</xml_diff>